<commit_message>
Close x4 720p15 FPS scheduler gate
</commit_message>
<xml_diff>
--- a/W8A12_3lane/output/docx/W8A12_3lane_contest_submission_report_complete_20260701.docx
+++ b/W8A12_3lane/output/docx/W8A12_3lane_contest_submission_report_complete_20260701.docx
@@ -6815,14 +6815,14 @@
           <w:b w:val="0"/>
           <w:color w:val="000000"/>
         </w:rPr>
-        <w:t xml:space="preserve">性能 scheduler 侧已补充 packed 2-D 规划证据：x4 720p15 在 </w:t>
+        <w:t xml:space="preserve">性能 scheduler 侧已补充 packed 2-D 规划证据，并新增独立 </w:t>
       </w:r>
       <w:r>
         <w:rPr>
           <w:rFonts w:ascii="Consolas" w:hAnsi="Consolas" w:eastAsia="Microsoft YaHei" w:cs="Consolas"/>
           <w:color w:val="000000"/>
         </w:rPr>
-        <w:t>24x64</w:t>
+        <w:t>x4_720p15_fps_closure</w:t>
       </w:r>
       <w:r>
         <w:rPr>
@@ -6830,14 +6830,14 @@
           <w:b w:val="0"/>
           <w:color w:val="000000"/>
         </w:rPr>
-        <w:t xml:space="preserve"> 和 </w:t>
+        <w:t xml:space="preserve"> 门禁。该门禁明确输出分辨率为 </w:t>
       </w:r>
       <w:r>
         <w:rPr>
           <w:rFonts w:ascii="Consolas" w:hAnsi="Consolas" w:eastAsia="Microsoft YaHei" w:cs="Consolas"/>
           <w:color w:val="000000"/>
         </w:rPr>
-        <w:t>24x72</w:t>
+        <w:t>1280x720</w:t>
       </w:r>
       <w:r>
         <w:rPr>
@@ -6845,7 +6845,703 @@
           <w:b w:val="0"/>
           <w:color w:val="000000"/>
         </w:rPr>
-        <w:t xml:space="preserve"> candidate 下分别为 15.070fps 和 17.501fps @250MHz，满足 scheduler-level 15fps；x2 720p20 已新增独立 xsim 证据，但 900-DSP 门限内 </w:t>
+        <w:t xml:space="preserve">，输入为 </w:t>
+      </w:r>
+      <w:r>
+        <w:rPr>
+          <w:rFonts w:ascii="Consolas" w:hAnsi="Consolas" w:eastAsia="Microsoft YaHei" w:cs="Consolas"/>
+          <w:color w:val="000000"/>
+        </w:rPr>
+        <w:t>320x180 LR</w:t>
+      </w:r>
+      <w:r>
+        <w:rPr>
+          <w:rFonts w:ascii="Microsoft YaHei" w:hAnsi="Microsoft YaHei" w:eastAsia="Microsoft YaHei" w:cs="Microsoft YaHei"/>
+          <w:b w:val="0"/>
+          <w:color w:val="000000"/>
+        </w:rPr>
+        <w:t xml:space="preserve">，闭合层级为 scheduler/performance-model，不声明板端实测 FPS 或完整 packed 2-D 像素 RTL bit-exact 闭合。证据见 </w:t>
+      </w:r>
+      <w:r>
+        <w:rPr>
+          <w:rFonts w:ascii="Consolas" w:hAnsi="Consolas" w:eastAsia="Microsoft YaHei" w:cs="Consolas"/>
+          <w:color w:val="000000"/>
+        </w:rPr>
+        <w:t>evidence/sim_fps_design_space/x4_720p15_fps_closure/summary.md</w:t>
+      </w:r>
+      <w:r>
+        <w:rPr>
+          <w:rFonts w:ascii="Microsoft YaHei" w:hAnsi="Microsoft YaHei" w:eastAsia="Microsoft YaHei" w:cs="Microsoft YaHei"/>
+          <w:b w:val="0"/>
+          <w:color w:val="000000"/>
+        </w:rPr>
+        <w:t>。</w:t>
+      </w:r>
+    </w:p>
+    <w:tbl>
+      <w:tblPr>
+        <w:tblStyle w:val="TableGrid"/>
+        <w:tblW w:type="dxa" w:w="9360"/>
+        <w:jc w:val="left"/>
+        <w:tblLayout w:type="fixed"/>
+        <w:tblLook w:firstColumn="1" w:firstRow="1" w:lastColumn="0" w:lastRow="0" w:noHBand="0" w:noVBand="1" w:val="04A0"/>
+        <w:tblInd w:w="120" w:type="dxa"/>
+      </w:tblPr>
+      <w:tblGrid>
+        <w:gridCol w:w="1991"/>
+        <w:gridCol w:w="1294"/>
+        <w:gridCol w:w="900"/>
+        <w:gridCol w:w="1095"/>
+        <w:gridCol w:w="996"/>
+        <w:gridCol w:w="3084"/>
+      </w:tblGrid>
+      <w:tr>
+        <w:trPr>
+          <w:tblHeader w:val="true"/>
+        </w:trPr>
+        <w:tc>
+          <w:tcPr>
+            <w:tcW w:type="dxa" w:w="1991"/>
+            <w:tcMar>
+              <w:top w:w="80" w:type="dxa"/>
+              <w:bottom w:w="80" w:type="dxa"/>
+              <w:start w:w="120" w:type="dxa"/>
+              <w:end w:w="120" w:type="dxa"/>
+            </w:tcMar>
+            <w:vAlign w:val="center"/>
+            <w:shd w:fill="F2F2F2"/>
+          </w:tcPr>
+          <w:p>
+            <w:pPr>
+              <w:spacing w:after="0"/>
+            </w:pPr>
+            <w:r>
+              <w:rPr>
+                <w:rFonts w:ascii="Microsoft YaHei" w:hAnsi="Microsoft YaHei" w:eastAsia="Microsoft YaHei" w:cs="Microsoft YaHei"/>
+                <w:b/>
+                <w:color w:val="000000"/>
+                <w:sz w:val="16"/>
+              </w:rPr>
+              <w:t>目标</w:t>
+            </w:r>
+          </w:p>
+        </w:tc>
+        <w:tc>
+          <w:tcPr>
+            <w:tcW w:type="dxa" w:w="1294"/>
+            <w:tcMar>
+              <w:top w:w="80" w:type="dxa"/>
+              <w:bottom w:w="80" w:type="dxa"/>
+              <w:start w:w="120" w:type="dxa"/>
+              <w:end w:w="120" w:type="dxa"/>
+            </w:tcMar>
+            <w:vAlign w:val="center"/>
+            <w:shd w:fill="F2F2F2"/>
+          </w:tcPr>
+          <w:p>
+            <w:pPr>
+              <w:spacing w:after="0"/>
+            </w:pPr>
+            <w:r>
+              <w:rPr>
+                <w:rFonts w:ascii="Microsoft YaHei" w:hAnsi="Microsoft YaHei" w:eastAsia="Microsoft YaHei" w:cs="Microsoft YaHei"/>
+                <w:b/>
+                <w:color w:val="000000"/>
+                <w:sz w:val="16"/>
+              </w:rPr>
+              <w:t>Candidate</w:t>
+            </w:r>
+          </w:p>
+        </w:tc>
+        <w:tc>
+          <w:tcPr>
+            <w:tcW w:type="dxa" w:w="900"/>
+            <w:tcMar>
+              <w:top w:w="80" w:type="dxa"/>
+              <w:bottom w:w="80" w:type="dxa"/>
+              <w:start w:w="120" w:type="dxa"/>
+              <w:end w:w="120" w:type="dxa"/>
+            </w:tcMar>
+            <w:vAlign w:val="center"/>
+            <w:shd w:fill="F2F2F2"/>
+          </w:tcPr>
+          <w:p>
+            <w:pPr>
+              <w:spacing w:after="0"/>
+            </w:pPr>
+            <w:r>
+              <w:rPr>
+                <w:rFonts w:ascii="Microsoft YaHei" w:hAnsi="Microsoft YaHei" w:eastAsia="Microsoft YaHei" w:cs="Microsoft YaHei"/>
+                <w:b/>
+                <w:color w:val="000000"/>
+                <w:sz w:val="16"/>
+              </w:rPr>
+              <w:t>DSP</w:t>
+            </w:r>
+          </w:p>
+        </w:tc>
+        <w:tc>
+          <w:tcPr>
+            <w:tcW w:type="dxa" w:w="1095"/>
+            <w:tcMar>
+              <w:top w:w="80" w:type="dxa"/>
+              <w:bottom w:w="80" w:type="dxa"/>
+              <w:start w:w="120" w:type="dxa"/>
+              <w:end w:w="120" w:type="dxa"/>
+            </w:tcMar>
+            <w:vAlign w:val="center"/>
+            <w:shd w:fill="F2F2F2"/>
+          </w:tcPr>
+          <w:p>
+            <w:pPr>
+              <w:spacing w:after="0"/>
+            </w:pPr>
+            <w:r>
+              <w:rPr>
+                <w:rFonts w:ascii="Microsoft YaHei" w:hAnsi="Microsoft YaHei" w:eastAsia="Microsoft YaHei" w:cs="Microsoft YaHei"/>
+                <w:b/>
+                <w:color w:val="000000"/>
+                <w:sz w:val="16"/>
+              </w:rPr>
+              <w:t>FPS @250MHz</w:t>
+            </w:r>
+          </w:p>
+        </w:tc>
+        <w:tc>
+          <w:tcPr>
+            <w:tcW w:type="dxa" w:w="996"/>
+            <w:tcMar>
+              <w:top w:w="80" w:type="dxa"/>
+              <w:bottom w:w="80" w:type="dxa"/>
+              <w:start w:w="120" w:type="dxa"/>
+              <w:end w:w="120" w:type="dxa"/>
+            </w:tcMar>
+            <w:vAlign w:val="center"/>
+            <w:shd w:fill="F2F2F2"/>
+          </w:tcPr>
+          <w:p>
+            <w:pPr>
+              <w:spacing w:after="0"/>
+            </w:pPr>
+            <w:r>
+              <w:rPr>
+                <w:rFonts w:ascii="Microsoft YaHei" w:hAnsi="Microsoft YaHei" w:eastAsia="Microsoft YaHei" w:cs="Microsoft YaHei"/>
+                <w:b/>
+                <w:color w:val="000000"/>
+                <w:sz w:val="16"/>
+              </w:rPr>
+              <w:t>15fps 余量</w:t>
+            </w:r>
+          </w:p>
+        </w:tc>
+        <w:tc>
+          <w:tcPr>
+            <w:tcW w:type="dxa" w:w="3084"/>
+            <w:tcMar>
+              <w:top w:w="80" w:type="dxa"/>
+              <w:bottom w:w="80" w:type="dxa"/>
+              <w:start w:w="120" w:type="dxa"/>
+              <w:end w:w="120" w:type="dxa"/>
+            </w:tcMar>
+            <w:vAlign w:val="center"/>
+            <w:shd w:fill="F2F2F2"/>
+          </w:tcPr>
+          <w:p>
+            <w:pPr>
+              <w:spacing w:after="0"/>
+            </w:pPr>
+            <w:r>
+              <w:rPr>
+                <w:rFonts w:ascii="Microsoft YaHei" w:hAnsi="Microsoft YaHei" w:eastAsia="Microsoft YaHei" w:cs="Microsoft YaHei"/>
+                <w:b/>
+                <w:color w:val="000000"/>
+                <w:sz w:val="16"/>
+              </w:rPr>
+              <w:t>当前结论</w:t>
+            </w:r>
+          </w:p>
+        </w:tc>
+      </w:tr>
+      <w:tr>
+        <w:tc>
+          <w:tcPr>
+            <w:tcW w:type="dxa" w:w="1991"/>
+            <w:tcMar>
+              <w:top w:w="80" w:type="dxa"/>
+              <w:bottom w:w="80" w:type="dxa"/>
+              <w:start w:w="120" w:type="dxa"/>
+              <w:end w:w="120" w:type="dxa"/>
+            </w:tcMar>
+            <w:vAlign w:val="center"/>
+          </w:tcPr>
+          <w:p>
+            <w:pPr>
+              <w:spacing w:after="0"/>
+            </w:pPr>
+            <w:r>
+              <w:rPr>
+                <w:rFonts w:ascii="Microsoft YaHei" w:hAnsi="Microsoft YaHei" w:eastAsia="Microsoft YaHei" w:cs="Microsoft YaHei"/>
+                <w:b w:val="0"/>
+                <w:color w:val="000000"/>
+                <w:sz w:val="16"/>
+              </w:rPr>
+              <w:t>x4 720p15 最低资源点</w:t>
+            </w:r>
+          </w:p>
+        </w:tc>
+        <w:tc>
+          <w:tcPr>
+            <w:tcW w:type="dxa" w:w="1294"/>
+            <w:tcMar>
+              <w:top w:w="80" w:type="dxa"/>
+              <w:bottom w:w="80" w:type="dxa"/>
+              <w:start w:w="120" w:type="dxa"/>
+              <w:end w:w="120" w:type="dxa"/>
+            </w:tcMar>
+            <w:vAlign w:val="center"/>
+          </w:tcPr>
+          <w:p>
+            <w:pPr>
+              <w:spacing w:after="0"/>
+            </w:pPr>
+            <w:r>
+              <w:rPr>
+                <w:rFonts w:ascii="Consolas" w:hAnsi="Consolas" w:eastAsia="Microsoft YaHei" w:cs="Consolas"/>
+                <w:color w:val="000000"/>
+                <w:sz w:val="16"/>
+              </w:rPr>
+              <w:t>24x64</w:t>
+            </w:r>
+          </w:p>
+        </w:tc>
+        <w:tc>
+          <w:tcPr>
+            <w:tcW w:type="dxa" w:w="900"/>
+            <w:tcMar>
+              <w:top w:w="80" w:type="dxa"/>
+              <w:bottom w:w="80" w:type="dxa"/>
+              <w:start w:w="120" w:type="dxa"/>
+              <w:end w:w="120" w:type="dxa"/>
+            </w:tcMar>
+            <w:vAlign w:val="center"/>
+          </w:tcPr>
+          <w:p>
+            <w:pPr>
+              <w:spacing w:after="0"/>
+            </w:pPr>
+            <w:r>
+              <w:rPr>
+                <w:rFonts w:ascii="Microsoft YaHei" w:hAnsi="Microsoft YaHei" w:eastAsia="Microsoft YaHei" w:cs="Microsoft YaHei"/>
+                <w:b w:val="0"/>
+                <w:color w:val="000000"/>
+                <w:sz w:val="16"/>
+              </w:rPr>
+              <w:t>792</w:t>
+            </w:r>
+          </w:p>
+        </w:tc>
+        <w:tc>
+          <w:tcPr>
+            <w:tcW w:type="dxa" w:w="1095"/>
+            <w:tcMar>
+              <w:top w:w="80" w:type="dxa"/>
+              <w:bottom w:w="80" w:type="dxa"/>
+              <w:start w:w="120" w:type="dxa"/>
+              <w:end w:w="120" w:type="dxa"/>
+            </w:tcMar>
+            <w:vAlign w:val="center"/>
+          </w:tcPr>
+          <w:p>
+            <w:pPr>
+              <w:spacing w:after="0"/>
+            </w:pPr>
+            <w:r>
+              <w:rPr>
+                <w:rFonts w:ascii="Microsoft YaHei" w:hAnsi="Microsoft YaHei" w:eastAsia="Microsoft YaHei" w:cs="Microsoft YaHei"/>
+                <w:b w:val="0"/>
+                <w:color w:val="000000"/>
+                <w:sz w:val="16"/>
+              </w:rPr>
+              <w:t>15.070</w:t>
+            </w:r>
+          </w:p>
+        </w:tc>
+        <w:tc>
+          <w:tcPr>
+            <w:tcW w:type="dxa" w:w="996"/>
+            <w:tcMar>
+              <w:top w:w="80" w:type="dxa"/>
+              <w:bottom w:w="80" w:type="dxa"/>
+              <w:start w:w="120" w:type="dxa"/>
+              <w:end w:w="120" w:type="dxa"/>
+            </w:tcMar>
+            <w:vAlign w:val="center"/>
+          </w:tcPr>
+          <w:p>
+            <w:pPr>
+              <w:spacing w:after="0"/>
+            </w:pPr>
+            <w:r>
+              <w:rPr>
+                <w:rFonts w:ascii="Microsoft YaHei" w:hAnsi="Microsoft YaHei" w:eastAsia="Microsoft YaHei" w:cs="Microsoft YaHei"/>
+                <w:b w:val="0"/>
+                <w:color w:val="000000"/>
+                <w:sz w:val="16"/>
+              </w:rPr>
+              <w:t>0.467%</w:t>
+            </w:r>
+          </w:p>
+        </w:tc>
+        <w:tc>
+          <w:tcPr>
+            <w:tcW w:type="dxa" w:w="3084"/>
+            <w:tcMar>
+              <w:top w:w="80" w:type="dxa"/>
+              <w:bottom w:w="80" w:type="dxa"/>
+              <w:start w:w="120" w:type="dxa"/>
+              <w:end w:w="120" w:type="dxa"/>
+            </w:tcMar>
+            <w:vAlign w:val="center"/>
+          </w:tcPr>
+          <w:p>
+            <w:pPr>
+              <w:spacing w:after="0"/>
+            </w:pPr>
+            <w:r>
+              <w:rPr>
+                <w:rFonts w:ascii="Microsoft YaHei" w:hAnsi="Microsoft YaHei" w:eastAsia="Microsoft YaHei" w:cs="Microsoft YaHei"/>
+                <w:b w:val="0"/>
+                <w:color w:val="000000"/>
+                <w:sz w:val="16"/>
+              </w:rPr>
+              <w:t>PASS，但余量很小</w:t>
+            </w:r>
+          </w:p>
+        </w:tc>
+      </w:tr>
+      <w:tr>
+        <w:tc>
+          <w:tcPr>
+            <w:tcW w:type="dxa" w:w="1991"/>
+            <w:tcMar>
+              <w:top w:w="80" w:type="dxa"/>
+              <w:bottom w:w="80" w:type="dxa"/>
+              <w:start w:w="120" w:type="dxa"/>
+              <w:end w:w="120" w:type="dxa"/>
+            </w:tcMar>
+            <w:vAlign w:val="center"/>
+          </w:tcPr>
+          <w:p>
+            <w:pPr>
+              <w:spacing w:after="0"/>
+            </w:pPr>
+            <w:r>
+              <w:rPr>
+                <w:rFonts w:ascii="Microsoft YaHei" w:hAnsi="Microsoft YaHei" w:eastAsia="Microsoft YaHei" w:cs="Microsoft YaHei"/>
+                <w:b w:val="0"/>
+                <w:color w:val="000000"/>
+                <w:sz w:val="16"/>
+              </w:rPr>
+              <w:t>x4 720p15 推荐闭合点</w:t>
+            </w:r>
+          </w:p>
+        </w:tc>
+        <w:tc>
+          <w:tcPr>
+            <w:tcW w:type="dxa" w:w="1294"/>
+            <w:tcMar>
+              <w:top w:w="80" w:type="dxa"/>
+              <w:bottom w:w="80" w:type="dxa"/>
+              <w:start w:w="120" w:type="dxa"/>
+              <w:end w:w="120" w:type="dxa"/>
+            </w:tcMar>
+            <w:vAlign w:val="center"/>
+          </w:tcPr>
+          <w:p>
+            <w:pPr>
+              <w:spacing w:after="0"/>
+            </w:pPr>
+            <w:r>
+              <w:rPr>
+                <w:rFonts w:ascii="Consolas" w:hAnsi="Consolas" w:eastAsia="Microsoft YaHei" w:cs="Consolas"/>
+                <w:color w:val="000000"/>
+                <w:sz w:val="16"/>
+              </w:rPr>
+              <w:t>24x72</w:t>
+            </w:r>
+          </w:p>
+        </w:tc>
+        <w:tc>
+          <w:tcPr>
+            <w:tcW w:type="dxa" w:w="900"/>
+            <w:tcMar>
+              <w:top w:w="80" w:type="dxa"/>
+              <w:bottom w:w="80" w:type="dxa"/>
+              <w:start w:w="120" w:type="dxa"/>
+              <w:end w:w="120" w:type="dxa"/>
+            </w:tcMar>
+            <w:vAlign w:val="center"/>
+          </w:tcPr>
+          <w:p>
+            <w:pPr>
+              <w:spacing w:after="0"/>
+            </w:pPr>
+            <w:r>
+              <w:rPr>
+                <w:rFonts w:ascii="Microsoft YaHei" w:hAnsi="Microsoft YaHei" w:eastAsia="Microsoft YaHei" w:cs="Microsoft YaHei"/>
+                <w:b w:val="0"/>
+                <w:color w:val="000000"/>
+                <w:sz w:val="16"/>
+              </w:rPr>
+              <w:t>888</w:t>
+            </w:r>
+          </w:p>
+        </w:tc>
+        <w:tc>
+          <w:tcPr>
+            <w:tcW w:type="dxa" w:w="1095"/>
+            <w:tcMar>
+              <w:top w:w="80" w:type="dxa"/>
+              <w:bottom w:w="80" w:type="dxa"/>
+              <w:start w:w="120" w:type="dxa"/>
+              <w:end w:w="120" w:type="dxa"/>
+            </w:tcMar>
+            <w:vAlign w:val="center"/>
+          </w:tcPr>
+          <w:p>
+            <w:pPr>
+              <w:spacing w:after="0"/>
+            </w:pPr>
+            <w:r>
+              <w:rPr>
+                <w:rFonts w:ascii="Microsoft YaHei" w:hAnsi="Microsoft YaHei" w:eastAsia="Microsoft YaHei" w:cs="Microsoft YaHei"/>
+                <w:b w:val="0"/>
+                <w:color w:val="000000"/>
+                <w:sz w:val="16"/>
+              </w:rPr>
+              <w:t>17.501</w:t>
+            </w:r>
+          </w:p>
+        </w:tc>
+        <w:tc>
+          <w:tcPr>
+            <w:tcW w:type="dxa" w:w="996"/>
+            <w:tcMar>
+              <w:top w:w="80" w:type="dxa"/>
+              <w:bottom w:w="80" w:type="dxa"/>
+              <w:start w:w="120" w:type="dxa"/>
+              <w:end w:w="120" w:type="dxa"/>
+            </w:tcMar>
+            <w:vAlign w:val="center"/>
+          </w:tcPr>
+          <w:p>
+            <w:pPr>
+              <w:spacing w:after="0"/>
+            </w:pPr>
+            <w:r>
+              <w:rPr>
+                <w:rFonts w:ascii="Microsoft YaHei" w:hAnsi="Microsoft YaHei" w:eastAsia="Microsoft YaHei" w:cs="Microsoft YaHei"/>
+                <w:b w:val="0"/>
+                <w:color w:val="000000"/>
+                <w:sz w:val="16"/>
+              </w:rPr>
+              <w:t>14.291%</w:t>
+            </w:r>
+          </w:p>
+        </w:tc>
+        <w:tc>
+          <w:tcPr>
+            <w:tcW w:type="dxa" w:w="3084"/>
+            <w:tcMar>
+              <w:top w:w="80" w:type="dxa"/>
+              <w:bottom w:w="80" w:type="dxa"/>
+              <w:start w:w="120" w:type="dxa"/>
+              <w:end w:w="120" w:type="dxa"/>
+            </w:tcMar>
+            <w:vAlign w:val="center"/>
+          </w:tcPr>
+          <w:p>
+            <w:pPr>
+              <w:spacing w:after="0"/>
+            </w:pPr>
+            <w:r>
+              <w:rPr>
+                <w:rFonts w:ascii="Microsoft YaHei" w:hAnsi="Microsoft YaHei" w:eastAsia="Microsoft YaHei" w:cs="Microsoft YaHei"/>
+                <w:b w:val="0"/>
+                <w:color w:val="000000"/>
+                <w:sz w:val="16"/>
+              </w:rPr>
+              <w:t>PASS，作为本报告推荐 FPS 闭合配置</w:t>
+            </w:r>
+          </w:p>
+        </w:tc>
+      </w:tr>
+      <w:tr>
+        <w:tc>
+          <w:tcPr>
+            <w:tcW w:type="dxa" w:w="1991"/>
+            <w:tcMar>
+              <w:top w:w="80" w:type="dxa"/>
+              <w:bottom w:w="80" w:type="dxa"/>
+              <w:start w:w="120" w:type="dxa"/>
+              <w:end w:w="120" w:type="dxa"/>
+            </w:tcMar>
+            <w:vAlign w:val="center"/>
+          </w:tcPr>
+          <w:p>
+            <w:pPr>
+              <w:spacing w:after="0"/>
+            </w:pPr>
+            <w:r>
+              <w:rPr>
+                <w:rFonts w:ascii="Microsoft YaHei" w:hAnsi="Microsoft YaHei" w:eastAsia="Microsoft YaHei" w:cs="Microsoft YaHei"/>
+                <w:b w:val="0"/>
+                <w:color w:val="000000"/>
+                <w:sz w:val="16"/>
+              </w:rPr>
+              <w:t>x2 720p20 资源门限内</w:t>
+            </w:r>
+          </w:p>
+        </w:tc>
+        <w:tc>
+          <w:tcPr>
+            <w:tcW w:type="dxa" w:w="1294"/>
+            <w:tcMar>
+              <w:top w:w="80" w:type="dxa"/>
+              <w:bottom w:w="80" w:type="dxa"/>
+              <w:start w:w="120" w:type="dxa"/>
+              <w:end w:w="120" w:type="dxa"/>
+            </w:tcMar>
+            <w:vAlign w:val="center"/>
+          </w:tcPr>
+          <w:p>
+            <w:pPr>
+              <w:spacing w:after="0"/>
+            </w:pPr>
+            <w:r>
+              <w:rPr>
+                <w:rFonts w:ascii="Consolas" w:hAnsi="Consolas" w:eastAsia="Microsoft YaHei" w:cs="Consolas"/>
+                <w:color w:val="000000"/>
+                <w:sz w:val="16"/>
+              </w:rPr>
+              <w:t>24x64/24x72</w:t>
+            </w:r>
+          </w:p>
+        </w:tc>
+        <w:tc>
+          <w:tcPr>
+            <w:tcW w:type="dxa" w:w="900"/>
+            <w:tcMar>
+              <w:top w:w="80" w:type="dxa"/>
+              <w:bottom w:w="80" w:type="dxa"/>
+              <w:start w:w="120" w:type="dxa"/>
+              <w:end w:w="120" w:type="dxa"/>
+            </w:tcMar>
+            <w:vAlign w:val="center"/>
+          </w:tcPr>
+          <w:p>
+            <w:pPr>
+              <w:spacing w:after="0"/>
+            </w:pPr>
+            <w:r>
+              <w:rPr>
+                <w:rFonts w:ascii="Microsoft YaHei" w:hAnsi="Microsoft YaHei" w:eastAsia="Microsoft YaHei" w:cs="Microsoft YaHei"/>
+                <w:b w:val="0"/>
+                <w:color w:val="000000"/>
+                <w:sz w:val="16"/>
+              </w:rPr>
+              <w:t>792/888</w:t>
+            </w:r>
+          </w:p>
+        </w:tc>
+        <w:tc>
+          <w:tcPr>
+            <w:tcW w:type="dxa" w:w="1095"/>
+            <w:tcMar>
+              <w:top w:w="80" w:type="dxa"/>
+              <w:bottom w:w="80" w:type="dxa"/>
+              <w:start w:w="120" w:type="dxa"/>
+              <w:end w:w="120" w:type="dxa"/>
+            </w:tcMar>
+            <w:vAlign w:val="center"/>
+          </w:tcPr>
+          <w:p>
+            <w:pPr>
+              <w:spacing w:after="0"/>
+            </w:pPr>
+            <w:r>
+              <w:rPr>
+                <w:rFonts w:ascii="Microsoft YaHei" w:hAnsi="Microsoft YaHei" w:eastAsia="Microsoft YaHei" w:cs="Microsoft YaHei"/>
+                <w:b w:val="0"/>
+                <w:color w:val="000000"/>
+                <w:sz w:val="16"/>
+              </w:rPr>
+              <w:t>3.861/4.483</w:t>
+            </w:r>
+          </w:p>
+        </w:tc>
+        <w:tc>
+          <w:tcPr>
+            <w:tcW w:type="dxa" w:w="996"/>
+            <w:tcMar>
+              <w:top w:w="80" w:type="dxa"/>
+              <w:bottom w:w="80" w:type="dxa"/>
+              <w:start w:w="120" w:type="dxa"/>
+              <w:end w:w="120" w:type="dxa"/>
+            </w:tcMar>
+            <w:vAlign w:val="center"/>
+          </w:tcPr>
+          <w:p>
+            <w:pPr>
+              <w:spacing w:after="0"/>
+            </w:pPr>
+            <w:r>
+              <w:rPr>
+                <w:rFonts w:ascii="Microsoft YaHei" w:hAnsi="Microsoft YaHei" w:eastAsia="Microsoft YaHei" w:cs="Microsoft YaHei"/>
+                <w:b w:val="0"/>
+                <w:color w:val="000000"/>
+                <w:sz w:val="16"/>
+              </w:rPr>
+              <w:t>不达标</w:t>
+            </w:r>
+          </w:p>
+        </w:tc>
+        <w:tc>
+          <w:tcPr>
+            <w:tcW w:type="dxa" w:w="3084"/>
+            <w:tcMar>
+              <w:top w:w="80" w:type="dxa"/>
+              <w:bottom w:w="80" w:type="dxa"/>
+              <w:start w:w="120" w:type="dxa"/>
+              <w:end w:w="120" w:type="dxa"/>
+            </w:tcMar>
+            <w:vAlign w:val="center"/>
+          </w:tcPr>
+          <w:p>
+            <w:pPr>
+              <w:spacing w:after="0"/>
+            </w:pPr>
+            <w:r>
+              <w:rPr>
+                <w:rFonts w:ascii="Microsoft YaHei" w:hAnsi="Microsoft YaHei" w:eastAsia="Microsoft YaHei" w:cs="Microsoft YaHei"/>
+                <w:b w:val="0"/>
+                <w:color w:val="000000"/>
+                <w:sz w:val="16"/>
+              </w:rPr>
+              <w:t>FAIL，不能声明 x2 720p20</w:t>
+            </w:r>
+          </w:p>
+        </w:tc>
+      </w:tr>
+    </w:tbl>
+    <w:p>
+      <w:r>
+        <w:rPr>
+          <w:rFonts w:ascii="Microsoft YaHei" w:hAnsi="Microsoft YaHei" w:eastAsia="Microsoft YaHei" w:cs="Microsoft YaHei"/>
+          <w:b w:val="0"/>
+          <w:color w:val="000000"/>
+        </w:rPr>
+        <w:t xml:space="preserve">x2 720p20 已新增独立 xsim 证据，但 900-DSP 门限内 </w:t>
       </w:r>
       <w:r>
         <w:rPr>
@@ -12246,6 +12942,23 @@
                 <w:sz w:val="16"/>
               </w:rPr>
               <w:t>evidence/sim_fps_design_space/packed2d_perf_scheduler/summary.md</w:t>
+            </w:r>
+            <w:r>
+              <w:rPr>
+                <w:rFonts w:ascii="Microsoft YaHei" w:hAnsi="Microsoft YaHei" w:eastAsia="Microsoft YaHei" w:cs="Microsoft YaHei"/>
+                <w:b w:val="0"/>
+                <w:color w:val="000000"/>
+                <w:sz w:val="16"/>
+              </w:rPr>
+              <w:t>、</w:t>
+            </w:r>
+            <w:r>
+              <w:rPr>
+                <w:rFonts w:ascii="Consolas" w:hAnsi="Consolas" w:eastAsia="Microsoft YaHei" w:cs="Consolas"/>
+                <w:color w:val="000000"/>
+                <w:sz w:val="16"/>
+              </w:rPr>
+              <w:t>evidence/sim_fps_design_space/x4_720p15_fps_closure/summary.md</w:t>
             </w:r>
             <w:r>
               <w:rPr>

</xml_diff>

<commit_message>
Add x2 720p4 FPS scheduler closure
</commit_message>
<xml_diff>
--- a/W8A12_3lane/output/docx/W8A12_3lane_contest_submission_report_complete_20260701.docx
+++ b/W8A12_3lane/output/docx/W8A12_3lane_contest_submission_report_complete_20260701.docx
@@ -6888,12 +6888,12 @@
         <w:tblInd w:w="120" w:type="dxa"/>
       </w:tblPr>
       <w:tblGrid>
-        <w:gridCol w:w="1991"/>
-        <w:gridCol w:w="1294"/>
+        <w:gridCol w:w="2069"/>
+        <w:gridCol w:w="1281"/>
         <w:gridCol w:w="900"/>
-        <w:gridCol w:w="1095"/>
-        <w:gridCol w:w="996"/>
-        <w:gridCol w:w="3084"/>
+        <w:gridCol w:w="1084"/>
+        <w:gridCol w:w="985"/>
+        <w:gridCol w:w="3041"/>
       </w:tblGrid>
       <w:tr>
         <w:trPr>
@@ -6901,7 +6901,7 @@
         </w:trPr>
         <w:tc>
           <w:tcPr>
-            <w:tcW w:type="dxa" w:w="1991"/>
+            <w:tcW w:type="dxa" w:w="2069"/>
             <w:tcMar>
               <w:top w:w="80" w:type="dxa"/>
               <w:bottom w:w="80" w:type="dxa"/>
@@ -6928,7 +6928,7 @@
         </w:tc>
         <w:tc>
           <w:tcPr>
-            <w:tcW w:type="dxa" w:w="1294"/>
+            <w:tcW w:type="dxa" w:w="1281"/>
             <w:tcMar>
               <w:top w:w="80" w:type="dxa"/>
               <w:bottom w:w="80" w:type="dxa"/>
@@ -6982,7 +6982,7 @@
         </w:tc>
         <w:tc>
           <w:tcPr>
-            <w:tcW w:type="dxa" w:w="1095"/>
+            <w:tcW w:type="dxa" w:w="1084"/>
             <w:tcMar>
               <w:top w:w="80" w:type="dxa"/>
               <w:bottom w:w="80" w:type="dxa"/>
@@ -7009,7 +7009,7 @@
         </w:tc>
         <w:tc>
           <w:tcPr>
-            <w:tcW w:type="dxa" w:w="996"/>
+            <w:tcW w:type="dxa" w:w="985"/>
             <w:tcMar>
               <w:top w:w="80" w:type="dxa"/>
               <w:bottom w:w="80" w:type="dxa"/>
@@ -7036,7 +7036,7 @@
         </w:tc>
         <w:tc>
           <w:tcPr>
-            <w:tcW w:type="dxa" w:w="3084"/>
+            <w:tcW w:type="dxa" w:w="3041"/>
             <w:tcMar>
               <w:top w:w="80" w:type="dxa"/>
               <w:bottom w:w="80" w:type="dxa"/>
@@ -7065,7 +7065,7 @@
       <w:tr>
         <w:tc>
           <w:tcPr>
-            <w:tcW w:type="dxa" w:w="1991"/>
+            <w:tcW w:type="dxa" w:w="2069"/>
             <w:tcMar>
               <w:top w:w="80" w:type="dxa"/>
               <w:bottom w:w="80" w:type="dxa"/>
@@ -7091,7 +7091,7 @@
         </w:tc>
         <w:tc>
           <w:tcPr>
-            <w:tcW w:type="dxa" w:w="1294"/>
+            <w:tcW w:type="dxa" w:w="1281"/>
             <w:tcMar>
               <w:top w:w="80" w:type="dxa"/>
               <w:bottom w:w="80" w:type="dxa"/>
@@ -7142,7 +7142,7 @@
         </w:tc>
         <w:tc>
           <w:tcPr>
-            <w:tcW w:type="dxa" w:w="1095"/>
+            <w:tcW w:type="dxa" w:w="1084"/>
             <w:tcMar>
               <w:top w:w="80" w:type="dxa"/>
               <w:bottom w:w="80" w:type="dxa"/>
@@ -7168,7 +7168,7 @@
         </w:tc>
         <w:tc>
           <w:tcPr>
-            <w:tcW w:type="dxa" w:w="996"/>
+            <w:tcW w:type="dxa" w:w="985"/>
             <w:tcMar>
               <w:top w:w="80" w:type="dxa"/>
               <w:bottom w:w="80" w:type="dxa"/>
@@ -7194,7 +7194,7 @@
         </w:tc>
         <w:tc>
           <w:tcPr>
-            <w:tcW w:type="dxa" w:w="3084"/>
+            <w:tcW w:type="dxa" w:w="3041"/>
             <w:tcMar>
               <w:top w:w="80" w:type="dxa"/>
               <w:bottom w:w="80" w:type="dxa"/>
@@ -7222,7 +7222,7 @@
       <w:tr>
         <w:tc>
           <w:tcPr>
-            <w:tcW w:type="dxa" w:w="1991"/>
+            <w:tcW w:type="dxa" w:w="2069"/>
             <w:tcMar>
               <w:top w:w="80" w:type="dxa"/>
               <w:bottom w:w="80" w:type="dxa"/>
@@ -7248,7 +7248,7 @@
         </w:tc>
         <w:tc>
           <w:tcPr>
-            <w:tcW w:type="dxa" w:w="1294"/>
+            <w:tcW w:type="dxa" w:w="1281"/>
             <w:tcMar>
               <w:top w:w="80" w:type="dxa"/>
               <w:bottom w:w="80" w:type="dxa"/>
@@ -7299,7 +7299,7 @@
         </w:tc>
         <w:tc>
           <w:tcPr>
-            <w:tcW w:type="dxa" w:w="1095"/>
+            <w:tcW w:type="dxa" w:w="1084"/>
             <w:tcMar>
               <w:top w:w="80" w:type="dxa"/>
               <w:bottom w:w="80" w:type="dxa"/>
@@ -7325,7 +7325,7 @@
         </w:tc>
         <w:tc>
           <w:tcPr>
-            <w:tcW w:type="dxa" w:w="996"/>
+            <w:tcW w:type="dxa" w:w="985"/>
             <w:tcMar>
               <w:top w:w="80" w:type="dxa"/>
               <w:bottom w:w="80" w:type="dxa"/>
@@ -7351,7 +7351,7 @@
         </w:tc>
         <w:tc>
           <w:tcPr>
-            <w:tcW w:type="dxa" w:w="3084"/>
+            <w:tcW w:type="dxa" w:w="3041"/>
             <w:tcMar>
               <w:top w:w="80" w:type="dxa"/>
               <w:bottom w:w="80" w:type="dxa"/>
@@ -7379,7 +7379,7 @@
       <w:tr>
         <w:tc>
           <w:tcPr>
-            <w:tcW w:type="dxa" w:w="1991"/>
+            <w:tcW w:type="dxa" w:w="2069"/>
             <w:tcMar>
               <w:top w:w="80" w:type="dxa"/>
               <w:bottom w:w="80" w:type="dxa"/>
@@ -7399,13 +7399,13 @@
                 <w:color w:val="000000"/>
                 <w:sz w:val="16"/>
               </w:rPr>
-              <w:t>x2 720p20 资源门限内</w:t>
-            </w:r>
-          </w:p>
-        </w:tc>
-        <w:tc>
-          <w:tcPr>
-            <w:tcW w:type="dxa" w:w="1294"/>
+              <w:t>x2 720p4 降目标闭合点</w:t>
+            </w:r>
+          </w:p>
+        </w:tc>
+        <w:tc>
+          <w:tcPr>
+            <w:tcW w:type="dxa" w:w="1281"/>
             <w:tcMar>
               <w:top w:w="80" w:type="dxa"/>
               <w:bottom w:w="80" w:type="dxa"/>
@@ -7424,7 +7424,7 @@
                 <w:color w:val="000000"/>
                 <w:sz w:val="16"/>
               </w:rPr>
-              <w:t>24x64/24x72</w:t>
+              <w:t>24x72</w:t>
             </w:r>
           </w:p>
         </w:tc>
@@ -7450,13 +7450,13 @@
                 <w:color w:val="000000"/>
                 <w:sz w:val="16"/>
               </w:rPr>
-              <w:t>792/888</w:t>
-            </w:r>
-          </w:p>
-        </w:tc>
-        <w:tc>
-          <w:tcPr>
-            <w:tcW w:type="dxa" w:w="1095"/>
+              <w:t>888</w:t>
+            </w:r>
+          </w:p>
+        </w:tc>
+        <w:tc>
+          <w:tcPr>
+            <w:tcW w:type="dxa" w:w="1084"/>
             <w:tcMar>
               <w:top w:w="80" w:type="dxa"/>
               <w:bottom w:w="80" w:type="dxa"/>
@@ -7476,13 +7476,13 @@
                 <w:color w:val="000000"/>
                 <w:sz w:val="16"/>
               </w:rPr>
-              <w:t>3.861/4.483</w:t>
-            </w:r>
-          </w:p>
-        </w:tc>
-        <w:tc>
-          <w:tcPr>
-            <w:tcW w:type="dxa" w:w="996"/>
+              <w:t>4.483</w:t>
+            </w:r>
+          </w:p>
+        </w:tc>
+        <w:tc>
+          <w:tcPr>
+            <w:tcW w:type="dxa" w:w="985"/>
             <w:tcMar>
               <w:top w:w="80" w:type="dxa"/>
               <w:bottom w:w="80" w:type="dxa"/>
@@ -7502,13 +7502,170 @@
                 <w:color w:val="000000"/>
                 <w:sz w:val="16"/>
               </w:rPr>
+              <w:t>10.789%</w:t>
+            </w:r>
+          </w:p>
+        </w:tc>
+        <w:tc>
+          <w:tcPr>
+            <w:tcW w:type="dxa" w:w="3041"/>
+            <w:tcMar>
+              <w:top w:w="80" w:type="dxa"/>
+              <w:bottom w:w="80" w:type="dxa"/>
+              <w:start w:w="120" w:type="dxa"/>
+              <w:end w:w="120" w:type="dxa"/>
+            </w:tcMar>
+            <w:vAlign w:val="center"/>
+          </w:tcPr>
+          <w:p>
+            <w:pPr>
+              <w:spacing w:after="0"/>
+            </w:pPr>
+            <w:r>
+              <w:rPr>
+                <w:rFonts w:ascii="Microsoft YaHei" w:hAnsi="Microsoft YaHei" w:eastAsia="Microsoft YaHei" w:cs="Microsoft YaHei"/>
+                <w:b w:val="0"/>
+                <w:color w:val="000000"/>
+                <w:sz w:val="16"/>
+              </w:rPr>
+              <w:t>PASS，作为 x2 降目标 FPS 闭合配置</w:t>
+            </w:r>
+          </w:p>
+        </w:tc>
+      </w:tr>
+      <w:tr>
+        <w:tc>
+          <w:tcPr>
+            <w:tcW w:type="dxa" w:w="2069"/>
+            <w:tcMar>
+              <w:top w:w="80" w:type="dxa"/>
+              <w:bottom w:w="80" w:type="dxa"/>
+              <w:start w:w="120" w:type="dxa"/>
+              <w:end w:w="120" w:type="dxa"/>
+            </w:tcMar>
+            <w:vAlign w:val="center"/>
+          </w:tcPr>
+          <w:p>
+            <w:pPr>
+              <w:spacing w:after="0"/>
+            </w:pPr>
+            <w:r>
+              <w:rPr>
+                <w:rFonts w:ascii="Microsoft YaHei" w:hAnsi="Microsoft YaHei" w:eastAsia="Microsoft YaHei" w:cs="Microsoft YaHei"/>
+                <w:b w:val="0"/>
+                <w:color w:val="000000"/>
+                <w:sz w:val="16"/>
+              </w:rPr>
+              <w:t>x2 720p20 资源门限内</w:t>
+            </w:r>
+          </w:p>
+        </w:tc>
+        <w:tc>
+          <w:tcPr>
+            <w:tcW w:type="dxa" w:w="1281"/>
+            <w:tcMar>
+              <w:top w:w="80" w:type="dxa"/>
+              <w:bottom w:w="80" w:type="dxa"/>
+              <w:start w:w="120" w:type="dxa"/>
+              <w:end w:w="120" w:type="dxa"/>
+            </w:tcMar>
+            <w:vAlign w:val="center"/>
+          </w:tcPr>
+          <w:p>
+            <w:pPr>
+              <w:spacing w:after="0"/>
+            </w:pPr>
+            <w:r>
+              <w:rPr>
+                <w:rFonts w:ascii="Consolas" w:hAnsi="Consolas" w:eastAsia="Microsoft YaHei" w:cs="Consolas"/>
+                <w:color w:val="000000"/>
+                <w:sz w:val="16"/>
+              </w:rPr>
+              <w:t>24x64/24x72</w:t>
+            </w:r>
+          </w:p>
+        </w:tc>
+        <w:tc>
+          <w:tcPr>
+            <w:tcW w:type="dxa" w:w="900"/>
+            <w:tcMar>
+              <w:top w:w="80" w:type="dxa"/>
+              <w:bottom w:w="80" w:type="dxa"/>
+              <w:start w:w="120" w:type="dxa"/>
+              <w:end w:w="120" w:type="dxa"/>
+            </w:tcMar>
+            <w:vAlign w:val="center"/>
+          </w:tcPr>
+          <w:p>
+            <w:pPr>
+              <w:spacing w:after="0"/>
+            </w:pPr>
+            <w:r>
+              <w:rPr>
+                <w:rFonts w:ascii="Microsoft YaHei" w:hAnsi="Microsoft YaHei" w:eastAsia="Microsoft YaHei" w:cs="Microsoft YaHei"/>
+                <w:b w:val="0"/>
+                <w:color w:val="000000"/>
+                <w:sz w:val="16"/>
+              </w:rPr>
+              <w:t>792/888</w:t>
+            </w:r>
+          </w:p>
+        </w:tc>
+        <w:tc>
+          <w:tcPr>
+            <w:tcW w:type="dxa" w:w="1084"/>
+            <w:tcMar>
+              <w:top w:w="80" w:type="dxa"/>
+              <w:bottom w:w="80" w:type="dxa"/>
+              <w:start w:w="120" w:type="dxa"/>
+              <w:end w:w="120" w:type="dxa"/>
+            </w:tcMar>
+            <w:vAlign w:val="center"/>
+          </w:tcPr>
+          <w:p>
+            <w:pPr>
+              <w:spacing w:after="0"/>
+            </w:pPr>
+            <w:r>
+              <w:rPr>
+                <w:rFonts w:ascii="Microsoft YaHei" w:hAnsi="Microsoft YaHei" w:eastAsia="Microsoft YaHei" w:cs="Microsoft YaHei"/>
+                <w:b w:val="0"/>
+                <w:color w:val="000000"/>
+                <w:sz w:val="16"/>
+              </w:rPr>
+              <w:t>3.861/4.483</w:t>
+            </w:r>
+          </w:p>
+        </w:tc>
+        <w:tc>
+          <w:tcPr>
+            <w:tcW w:type="dxa" w:w="985"/>
+            <w:tcMar>
+              <w:top w:w="80" w:type="dxa"/>
+              <w:bottom w:w="80" w:type="dxa"/>
+              <w:start w:w="120" w:type="dxa"/>
+              <w:end w:w="120" w:type="dxa"/>
+            </w:tcMar>
+            <w:vAlign w:val="center"/>
+          </w:tcPr>
+          <w:p>
+            <w:pPr>
+              <w:spacing w:after="0"/>
+            </w:pPr>
+            <w:r>
+              <w:rPr>
+                <w:rFonts w:ascii="Microsoft YaHei" w:hAnsi="Microsoft YaHei" w:eastAsia="Microsoft YaHei" w:cs="Microsoft YaHei"/>
+                <w:b w:val="0"/>
+                <w:color w:val="000000"/>
+                <w:sz w:val="16"/>
+              </w:rPr>
               <w:t>不达标</w:t>
             </w:r>
           </w:p>
         </w:tc>
         <w:tc>
           <w:tcPr>
-            <w:tcW w:type="dxa" w:w="3084"/>
+            <w:tcW w:type="dxa" w:w="3041"/>
             <w:tcMar>
               <w:top w:w="80" w:type="dxa"/>
               <w:bottom w:w="80" w:type="dxa"/>
@@ -7571,7 +7728,67 @@
           <w:b w:val="0"/>
           <w:color w:val="000000"/>
         </w:rPr>
-        <w:t xml:space="preserve"> 为 17.223fps 且 DSP=3504，因此当前完整 W8A12/F48 packed 2-D 规划不能声明 x2 720p20 已达标。</w:t>
+        <w:t xml:space="preserve"> 为 17.223fps 且 DSP=3504，因此当前完整 W8A12/F48 packed 2-D 规划不能声明 x2 720p20 已达标。按“降低 x2 FPS 目标”的补充口径，新增 </w:t>
+      </w:r>
+      <w:r>
+        <w:rPr>
+          <w:rFonts w:ascii="Consolas" w:hAnsi="Consolas" w:eastAsia="Microsoft YaHei" w:cs="Consolas"/>
+          <w:color w:val="000000"/>
+        </w:rPr>
+        <w:t>x2_720p4_fps_closure</w:t>
+      </w:r>
+      <w:r>
+        <w:rPr>
+          <w:rFonts w:ascii="Microsoft YaHei" w:hAnsi="Microsoft YaHei" w:eastAsia="Microsoft YaHei" w:cs="Microsoft YaHei"/>
+          <w:b w:val="0"/>
+          <w:color w:val="000000"/>
+        </w:rPr>
+        <w:t xml:space="preserve"> 门禁；其中 </w:t>
+      </w:r>
+      <w:r>
+        <w:rPr>
+          <w:rFonts w:ascii="Consolas" w:hAnsi="Consolas" w:eastAsia="Microsoft YaHei" w:cs="Consolas"/>
+          <w:color w:val="000000"/>
+        </w:rPr>
+        <w:t>24x72</w:t>
+      </w:r>
+      <w:r>
+        <w:rPr>
+          <w:rFonts w:ascii="Microsoft YaHei" w:hAnsi="Microsoft YaHei" w:eastAsia="Microsoft YaHei" w:cs="Microsoft YaHei"/>
+          <w:b w:val="0"/>
+          <w:color w:val="000000"/>
+        </w:rPr>
+        <w:t xml:space="preserve"> 为 4.483fps @250MHz、888 DSP、4fps 余量 10.789%，在 900-DSP 门限内达成 x2 720p4 scheduler-level 闭合；</w:t>
+      </w:r>
+      <w:r>
+        <w:rPr>
+          <w:rFonts w:ascii="Consolas" w:hAnsi="Consolas" w:eastAsia="Microsoft YaHei" w:cs="Consolas"/>
+          <w:color w:val="000000"/>
+        </w:rPr>
+        <w:t>24x64</w:t>
+      </w:r>
+      <w:r>
+        <w:rPr>
+          <w:rFonts w:ascii="Microsoft YaHei" w:hAnsi="Microsoft YaHei" w:eastAsia="Microsoft YaHei" w:cs="Microsoft YaHei"/>
+          <w:b w:val="0"/>
+          <w:color w:val="000000"/>
+        </w:rPr>
+        <w:t xml:space="preserve"> 为 3.861fps，仅作为低资源边界点。证据见 </w:t>
+      </w:r>
+      <w:r>
+        <w:rPr>
+          <w:rFonts w:ascii="Consolas" w:hAnsi="Consolas" w:eastAsia="Microsoft YaHei" w:cs="Consolas"/>
+          <w:color w:val="000000"/>
+        </w:rPr>
+        <w:t>evidence/sim_fps_design_space/x2_720p4_fps_closure/summary.md</w:t>
+      </w:r>
+      <w:r>
+        <w:rPr>
+          <w:rFonts w:ascii="Microsoft YaHei" w:hAnsi="Microsoft YaHei" w:eastAsia="Microsoft YaHei" w:cs="Microsoft YaHei"/>
+          <w:b w:val="0"/>
+          <w:color w:val="000000"/>
+        </w:rPr>
+        <w:t>。</w:t>
       </w:r>
     </w:p>
     <w:p>
@@ -12959,6 +13176,23 @@
                 <w:sz w:val="16"/>
               </w:rPr>
               <w:t>evidence/sim_fps_design_space/x4_720p15_fps_closure/summary.md</w:t>
+            </w:r>
+            <w:r>
+              <w:rPr>
+                <w:rFonts w:ascii="Microsoft YaHei" w:hAnsi="Microsoft YaHei" w:eastAsia="Microsoft YaHei" w:cs="Microsoft YaHei"/>
+                <w:b w:val="0"/>
+                <w:color w:val="000000"/>
+                <w:sz w:val="16"/>
+              </w:rPr>
+              <w:t>、</w:t>
+            </w:r>
+            <w:r>
+              <w:rPr>
+                <w:rFonts w:ascii="Consolas" w:hAnsi="Consolas" w:eastAsia="Microsoft YaHei" w:cs="Consolas"/>
+                <w:color w:val="000000"/>
+                <w:sz w:val="16"/>
+              </w:rPr>
+              <w:t>evidence/sim_fps_design_space/x2_720p4_fps_closure/summary.md</w:t>
             </w:r>
             <w:r>
               <w:rPr>

</xml_diff>